<commit_message>
update: revised Word document and renamed PowerPoint to RMQ_Optimizacion.pptx
</commit_message>
<xml_diff>
--- a/doc/Trabajo Final.docx
+++ b/doc/Trabajo Final.docx
@@ -127,43 +127,7 @@
           <w:sz w:val="19"/>
           <w:lang w:val="es-CO"/>
         </w:rPr>
-        <w:t xml:space="preserve">El problema de Consulta de Mínimo en Rango </w:t>
-      </w:r>
-      <w:r>
-        <w:rPr>
-          <w:rFonts w:ascii="Arial" w:hAnsi="Arial"/>
-          <w:i/>
-          <w:sz w:val="19"/>
-          <w:lang w:val="es-CO"/>
-        </w:rPr>
-        <w:t xml:space="preserve">(RMQ) consiste en hallar el valor mínimo dentro de un subarreglo arbitrario de una secuencia estática. El enfoque tradicional requiere recorrer secuencialmente el rango con un costo temporal de O(N) por consulta. En este trabajo se investiga, implementa y </w:t>
-      </w:r>
-      <w:r>
-        <w:rPr>
-          <w:rFonts w:ascii="Arial" w:hAnsi="Arial"/>
-          <w:i/>
-          <w:sz w:val="19"/>
-          <w:lang w:val="es-CO"/>
-        </w:rPr>
-        <w:t>demuestra la optimización de este problema mediante la estructura de datos Sparse Table (Tabla Dispersa). Aprovechando la propiedad matemática de idempotencia del operador mínimo y precomputación mediante programación dinámica, esta estructura reduce la co</w:t>
-      </w:r>
-      <w:r>
-        <w:rPr>
-          <w:rFonts w:ascii="Arial" w:hAnsi="Arial"/>
-          <w:i/>
-          <w:sz w:val="19"/>
-          <w:lang w:val="es-CO"/>
-        </w:rPr>
-        <w:t>mplejidad temporal de las consultas a un costo constante de O(1). Los resultados empíricos validan esta mejora asintótica, demostrando un incremento de rendimiento superior a 3700x en conjuntos de datos a gran escala. El código de los algoritmos y la docum</w:t>
-      </w:r>
-      <w:r>
-        <w:rPr>
-          <w:rFonts w:ascii="Arial" w:hAnsi="Arial"/>
-          <w:i/>
-          <w:sz w:val="19"/>
-          <w:lang w:val="es-CO"/>
-        </w:rPr>
-        <w:t>entación se encuentran en el repositorio oficial.</w:t>
+        <w:t>El problema de Consulta de Mínimo en Rango (RMQ) consiste en hallar el valor mínimo dentro de un subarreglo arbitrario de una secuencia estática. El enfoque tradicional requiere recorrer secuencialmente el rango con un costo temporal de O(N) por consulta. En este trabajo se investiga, implementa y demuestra la optimización de este problema mediante la estructura de datos Sparse Table (Tabla Dispersa). Aprovechando la propiedad matemática de idempotencia del operador mínimo y precomputación mediante programación dinámica, esta estructura reduce la complejidad temporal de las consultas a un costo constante de O(1). Los resultados empíricos validan esta mejora asintótica, demostrando un incremento de rendimiento superior a 3700x en conjuntos de datos a gran escala. El código de los algoritmos y la documentación se encuentran en el repositorio oficial.</w:t>
       </w:r>
     </w:p>
     <w:p>
@@ -199,14 +163,7 @@
           <w:rFonts w:ascii="Arial" w:hAnsi="Arial"/>
           <w:lang w:val="es-CO"/>
         </w:rPr>
-        <w:t>El procesamiento eficiente de consultas sobre colecciones de datos es un pilar fundamental para la escalabilidad en el desarrollo de software. Consideremos el problema RMQ: dado un arreglo e</w:t>
-      </w:r>
-      <w:r>
-        <w:rPr>
-          <w:rFonts w:ascii="Arial" w:hAnsi="Arial"/>
-          <w:lang w:val="es-CO"/>
-        </w:rPr>
-        <w:t>stático A de tamaño N, y un rango de consulta [L, R], deseamos encontrar el valor mínimo en ese intervalo.</w:t>
+        <w:t>El procesamiento eficiente de consultas sobre colecciones de datos es un pilar fundamental para la escalabilidad en el desarrollo de software. Consideremos el problema RMQ: dado un arreglo estático A de tamaño N, y un rango de consulta [L, R], deseamos encontrar el valor mínimo en ese intervalo.</w:t>
       </w:r>
     </w:p>
     <w:p>
@@ -222,14 +179,7 @@
           <w:rFonts w:ascii="Arial" w:hAnsi="Arial"/>
           <w:lang w:val="es-CO"/>
         </w:rPr>
-        <w:t xml:space="preserve">La aproximación secuencial simple realiza un bucle desde L hasta R, acumulando el mínimo en tiempo lineal O(N). Cuando la cantidad de consultas Q es </w:t>
-      </w:r>
-      <w:r>
-        <w:rPr>
-          <w:rFonts w:ascii="Arial" w:hAnsi="Arial"/>
-          <w:lang w:val="es-CO"/>
-        </w:rPr>
-        <w:t>masiva, el costo total escala a O(Q * N), convirtiéndose en un cuello de botella computacional crítico en aplicaciones que manejan altos volúmenes de tráfico.</w:t>
+        <w:t>La aproximación secuencial simple realiza un bucle desde L hasta R, acumulando el mínimo en tiempo lineal O(N). Cuando la cantidad de consultas Q es masiva, el costo total escala a O(Q * N), convirtiéndose en un cuello de botella computacional crítico en aplicaciones que manejan altos volúmenes de tráfico.</w:t>
       </w:r>
     </w:p>
     <w:p>
@@ -265,14 +215,7 @@
           <w:rFonts w:ascii="Arial" w:hAnsi="Arial"/>
           <w:lang w:val="es-CO"/>
         </w:rPr>
-        <w:t>Para optimizar el costo de consulta a tiempo constante O(1), empleamos l</w:t>
-      </w:r>
-      <w:r>
-        <w:rPr>
-          <w:rFonts w:ascii="Arial" w:hAnsi="Arial"/>
-          <w:lang w:val="es-CO"/>
-        </w:rPr>
-        <w:t>a estructura de datos Sparse Table (Tabla Dispersa), la cual se basa en la pre</w:t>
+        <w:t>Para optimizar el costo de consulta a tiempo constante O(1), empleamos la estructura de datos Sparse Table (Tabla Dispersa), la cual se basa en la pre</w:t>
       </w:r>
       <w:r>
         <w:rPr>
@@ -351,14 +294,7 @@
           <w:rFonts w:ascii="Arial" w:hAnsi="Arial"/>
           <w:lang w:val="es-CO"/>
         </w:rPr>
-        <w:t xml:space="preserve">Definimos la matriz ST[i][j] como el mínimo en el rango [i, i + 2^j </w:t>
-      </w:r>
-      <w:r>
-        <w:rPr>
-          <w:rFonts w:ascii="Arial" w:hAnsi="Arial"/>
-          <w:lang w:val="es-CO"/>
-        </w:rPr>
-        <w:t>- 1]. La construcción de esta tabla se formula recursivamente como:</w:t>
+        <w:t>Definimos la matriz ST[i][j] como el mínimo en el rango [i, i + 2^j - 1]. La construcción de esta tabla se formula recursivamente como:</w:t>
       </w:r>
     </w:p>
     <w:p>
@@ -437,14 +373,7 @@
           <w:lang w:val="es-CO"/>
         </w:rPr>
         <w:lastRenderedPageBreak/>
-        <w:t>Esta fase de precomputación requiere llenar una ma</w:t>
-      </w:r>
-      <w:r>
-        <w:rPr>
-          <w:rFonts w:ascii="Arial" w:hAnsi="Arial"/>
-          <w:lang w:val="es-CO"/>
-        </w:rPr>
-        <w:t>triz de dimensiones N x (log2(N) + 1), lo que implica un costo computacional y espacial de O(N log N).</w:t>
+        <w:t>Esta fase de precomputación requiere llenar una matriz de dimensiones N x (log2(N) + 1), lo que implica un costo computacional y espacial de O(N log N).</w:t>
       </w:r>
     </w:p>
     <w:p>
@@ -479,14 +408,7 @@
           <w:rFonts w:ascii="Arial" w:hAnsi="Arial"/>
           <w:lang w:val="es-CO"/>
         </w:rPr>
-        <w:t>La optimización clave se fundamenta en la propiedad matemática de idempotencia del operador mínimo, la cual estable</w:t>
-      </w:r>
-      <w:r>
-        <w:rPr>
-          <w:rFonts w:ascii="Arial" w:hAnsi="Arial"/>
-          <w:lang w:val="es-CO"/>
-        </w:rPr>
-        <w:t>ce que:</w:t>
+        <w:t>La optimización clave se fundamenta en la propiedad matemática de idempotencia del operador mínimo, la cual establece que:</w:t>
       </w:r>
     </w:p>
     <w:p>
@@ -521,14 +443,7 @@
           <w:rFonts w:ascii="Arial" w:hAnsi="Arial"/>
           <w:lang w:val="es-CO"/>
         </w:rPr>
-        <w:t>Dado un rango [L, R] de longitud len = R - L + 1, definimos k = floor(log2(len)). Como 2^k &lt;= len &lt; 2^(k+1), podemos cubrir el rango completo [L, R] mediante la unión de dos intervalos solapados de longitud 2^k: el primero iniciando e</w:t>
-      </w:r>
-      <w:r>
-        <w:rPr>
-          <w:rFonts w:ascii="Arial" w:hAnsi="Arial"/>
-          <w:lang w:val="es-CO"/>
-        </w:rPr>
-        <w:t>n L y el segundo finalizando en R.</w:t>
+        <w:t>Dado un rango [L, R] de longitud len = R - L + 1, definimos k = floor(log2(len)). Como 2^k &lt;= len &lt; 2^(k+1), podemos cubrir el rango completo [L, R] mediante la unión de dos intervalos solapados de longitud 2^k: el primero iniciando en L y el segundo finalizando en R.</w:t>
       </w:r>
     </w:p>
     <w:p>
@@ -578,14 +493,7 @@
           <w:rFonts w:ascii="Arial" w:hAnsi="Arial"/>
           <w:lang w:val="es-CO"/>
         </w:rPr>
-        <w:t xml:space="preserve">Esto reduce drásticamente la complejidad acumulada </w:t>
-      </w:r>
-      <w:r>
-        <w:rPr>
-          <w:rFonts w:ascii="Arial" w:hAnsi="Arial"/>
-          <w:lang w:val="es-CO"/>
-        </w:rPr>
-        <w:t>de Q consultas de un costo de O(Q * N) a un costo altamente escalable de:</w:t>
+        <w:t>Esto reduce drásticamente la complejidad acumulada de Q consultas de un costo de O(Q * N) a un costo altamente escalable de:</w:t>
       </w:r>
     </w:p>
     <w:p>
@@ -642,13 +550,7 @@
         <w:rPr>
           <w:rFonts w:ascii="Arial" w:hAnsi="Arial"/>
         </w:rPr>
-        <w:t xml:space="preserve">Para un escenario masivo con N = 500,000 y Q = </w:t>
-      </w:r>
-      <w:r>
-        <w:rPr>
-          <w:rFonts w:ascii="Arial" w:hAnsi="Arial"/>
-        </w:rPr>
-        <w:t>1,000,000:</w:t>
+        <w:t>Para un escenario masivo con N = 500,000 y Q = 1,000,000:</w:t>
       </w:r>
     </w:p>
     <w:p>
@@ -712,14 +614,7 @@
           <w:rFonts w:ascii="Arial" w:hAnsi="Arial"/>
           <w:lang w:val="es-CO"/>
         </w:rPr>
-        <w:t xml:space="preserve">El incremento de velocidad </w:t>
-      </w:r>
-      <w:r>
-        <w:rPr>
-          <w:rFonts w:ascii="Arial" w:hAnsi="Arial"/>
-          <w:lang w:val="es-CO"/>
-        </w:rPr>
-        <w:t>(speedup) específico en las consultas alcanza un factor de 3743.1x, demostrando la viabilidad de la optimización en sistemas de alta disponibilidad.</w:t>
+        <w:t>El incremento de velocidad (speedup) específico en las consultas alcanza un factor de 3743.1x, demostrando la viabilidad de la optimización en sistemas de alta disponibilidad.</w:t>
       </w:r>
     </w:p>
     <w:tbl>
@@ -2090,16 +1985,7 @@
           <w:sz w:val="17"/>
           <w:lang w:val="es-CO"/>
         </w:rPr>
-        <w:t xml:space="preserve">*Nota: Tiempos con asterisco (*) son estimaciones proyectadas debido al costo </w:t>
-      </w:r>
-      <w:r>
-        <w:rPr>
-          <w:rFonts w:ascii="Arial" w:hAnsi="Arial"/>
-          <w:i/>
-          <w:sz w:val="17"/>
-          <w:lang w:val="es-CO"/>
-        </w:rPr>
-        <w:t>inviable del algoritmo secuencial.</w:t>
+        <w:t>*Nota: Tiempos con asterisco (*) son estimaciones proyectadas debido al costo inviable del algoritmo secuencial.</w:t>
       </w:r>
     </w:p>
     <w:p>
@@ -2107,6 +1993,7 @@
         <w:keepNext/>
         <w:spacing w:before="280" w:after="120"/>
         <w:rPr>
+          <w:color w:val="C00000"/>
           <w:lang w:val="es-CO"/>
         </w:rPr>
       </w:pPr>
@@ -2114,7 +2001,7 @@
         <w:rPr>
           <w:rFonts w:ascii="Arial" w:hAnsi="Arial"/>
           <w:b/>
-          <w:color w:val="1F4E79"/>
+          <w:color w:val="C00000"/>
           <w:sz w:val="26"/>
           <w:lang w:val="es-CO"/>
         </w:rPr>
@@ -2158,14 +2045,7 @@
           <w:rFonts w:ascii="Arial" w:hAnsi="Arial"/>
           <w:lang w:val="es-CO"/>
         </w:rPr>
-        <w:t xml:space="preserve">Resolución en O(1) de la consulta del Ancestro Común más Bajo (LCA) en árboles mediante su reducción a </w:t>
-      </w:r>
-      <w:r>
-        <w:rPr>
-          <w:rFonts w:ascii="Arial" w:hAnsi="Arial"/>
-          <w:lang w:val="es-CO"/>
-        </w:rPr>
-        <w:t>un problema RMQ. Esencial en motores de bases de datos XML/JSON y bases de datos de grafos.</w:t>
+        <w:t>Resolución en O(1) de la consulta del Ancestro Común más Bajo (LCA) en árboles mediante su reducción a un problema RMQ. Esencial en motores de bases de datos XML/JSON y bases de datos de grafos.</w:t>
       </w:r>
     </w:p>
     <w:p>
@@ -2189,14 +2069,7 @@
           <w:rFonts w:ascii="Arial" w:hAnsi="Arial"/>
           <w:lang w:val="es-CO"/>
         </w:rPr>
-        <w:t>Cálculo en O(1) del Prefijo Común más Largo (LCP) sobre Arreglos de Sufijos (Suffix Arrays), utilizado en alineadores de se</w:t>
-      </w:r>
-      <w:r>
-        <w:rPr>
-          <w:rFonts w:ascii="Arial" w:hAnsi="Arial"/>
-          <w:lang w:val="es-CO"/>
-        </w:rPr>
-        <w:t>cuencias genómicas a gran escala en investigación de ADN.</w:t>
+        <w:t>Cálculo en O(1) del Prefijo Común más Largo (LCP) sobre Arreglos de Sufijos (Suffix Arrays), utilizado en alineadores de secuencias genómicas a gran escala en investigación de ADN.</w:t>
       </w:r>
     </w:p>
     <w:p>
@@ -2228,6 +2101,7 @@
         <w:keepNext/>
         <w:spacing w:before="280" w:after="120"/>
         <w:rPr>
+          <w:color w:val="C00000"/>
           <w:lang w:val="es-CO"/>
         </w:rPr>
       </w:pPr>
@@ -2235,7 +2109,7 @@
         <w:rPr>
           <w:rFonts w:ascii="Arial" w:hAnsi="Arial"/>
           <w:b/>
-          <w:color w:val="1F4E79"/>
+          <w:color w:val="C00000"/>
           <w:sz w:val="26"/>
           <w:lang w:val="es-CO"/>
         </w:rPr>
@@ -2255,21 +2129,7 @@
           <w:rFonts w:ascii="Arial" w:hAnsi="Arial"/>
           <w:lang w:val="es-CO"/>
         </w:rPr>
-        <w:t>La optimización del problema RMQ demuestra cómo l</w:t>
-      </w:r>
-      <w:r>
-        <w:rPr>
-          <w:rFonts w:ascii="Arial" w:hAnsi="Arial"/>
-          <w:lang w:val="es-CO"/>
-        </w:rPr>
-        <w:t xml:space="preserve">a estructuración del espacio de búsqueda a través de precomputación inteligente y el aprovechamiento de propiedades algebraicas (idempotencia) permite evadir las limitaciones físicas del procesamiento lineal ordinario, permitiendo una escalabilidad masiva </w:t>
-      </w:r>
-      <w:r>
-        <w:rPr>
-          <w:rFonts w:ascii="Arial" w:hAnsi="Arial"/>
-          <w:lang w:val="es-CO"/>
-        </w:rPr>
-        <w:t>y sostenible ante cargas de datos críticas en el mundo real.</w:t>
+        <w:t>La optimización del problema RMQ demuestra cómo la estructuración del espacio de búsqueda a través de precomputación inteligente y el aprovechamiento de propiedades algebraicas (idempotencia) permite evadir las limitaciones físicas del procesamiento lineal ordinario, permitiendo una escalabilidad masiva y sostenible ante cargas de datos críticas en el mundo real.</w:t>
       </w:r>
     </w:p>
     <w:p>
@@ -2277,6 +2137,7 @@
         <w:keepNext/>
         <w:spacing w:before="280" w:after="120"/>
         <w:rPr>
+          <w:color w:val="C00000"/>
           <w:lang w:val="es-CO"/>
         </w:rPr>
       </w:pPr>
@@ -2284,7 +2145,7 @@
         <w:rPr>
           <w:rFonts w:ascii="Arial" w:hAnsi="Arial"/>
           <w:b/>
-          <w:color w:val="1F4E79"/>
+          <w:color w:val="C00000"/>
           <w:sz w:val="26"/>
           <w:lang w:val="es-CO"/>
         </w:rPr>
@@ -2312,20 +2173,22 @@
         </w:rPr>
         <w:br/>
       </w:r>
-      <w:r>
-        <w:rPr>
-          <w:rFonts w:ascii="Consolas" w:hAnsi="Consolas"/>
-          <w:b/>
-          <w:color w:val="1F4E79"/>
-          <w:sz w:val="21"/>
-          <w:lang w:val="es-CO"/>
-        </w:rPr>
-        <w:t>https://github.com/nicotitopp/trabajoFinal.git</w:t>
-      </w:r>
+      <w:hyperlink r:id="rId8" w:history="1">
+        <w:r>
+          <w:rPr>
+            <w:rStyle w:val="Hipervnculo"/>
+            <w:rFonts w:ascii="Consolas" w:hAnsi="Consolas"/>
+            <w:b/>
+            <w:sz w:val="21"/>
+            <w:lang w:val="es-CO"/>
+          </w:rPr>
+          <w:t>https://github.com/nicotitopp/trabajoFinal.git</w:t>
+        </w:r>
+      </w:hyperlink>
     </w:p>
     <w:sectPr>
-      <w:headerReference w:type="default" r:id="rId8"/>
-      <w:footerReference w:type="default" r:id="rId9"/>
+      <w:headerReference w:type="default" r:id="rId9"/>
+      <w:footerReference w:type="default" r:id="rId10"/>
       <w:pgSz w:w="12240" w:h="15840"/>
       <w:pgMar w:top="1440" w:right="1440" w:bottom="1440" w:left="1440" w:header="720" w:footer="720" w:gutter="0"/>
       <w:cols w:space="720"/>
@@ -2374,6 +2237,7 @@
         <w:docPartUnique/>
       </w:docPartObj>
     </w:sdtPr>
+    <w:sdtEndPr/>
     <w:sdtContent>
       <w:p>
         <w:pPr>
@@ -3029,11 +2893,6 @@
     <w:lsdException w:name="Book Title" w:uiPriority="33" w:qFormat="1"/>
     <w:lsdException w:name="Bibliography" w:semiHidden="1" w:uiPriority="37" w:unhideWhenUsed="1"/>
     <w:lsdException w:name="TOC Heading" w:semiHidden="1" w:uiPriority="39" w:unhideWhenUsed="1" w:qFormat="1"/>
-    <w:lsdException w:name="Plain Table 5" w:semiHidden="1" w:unhideWhenUsed="1"/>
-    <w:lsdException w:name="Grid Table Light" w:semiHidden="1" w:unhideWhenUsed="1"/>
-    <w:lsdException w:name="Grid Table 1 Light" w:semiHidden="1" w:unhideWhenUsed="1"/>
-    <w:lsdException w:name="Grid Table 2" w:semiHidden="1" w:unhideWhenUsed="1"/>
-    <w:lsdException w:name="Grid Table 3" w:semiHidden="1" w:unhideWhenUsed="1"/>
     <w:lsdException w:name="Grid Table 4" w:uiPriority="49"/>
     <w:lsdException w:name="Grid Table 5 Dark" w:uiPriority="50"/>
     <w:lsdException w:name="Grid Table 6 Colorful" w:uiPriority="51"/>
@@ -14128,6 +13987,29 @@
         <w:shd w:val="clear" w:color="auto" w:fill="FBCAA2" w:themeFill="accent6" w:themeFillTint="7F"/>
       </w:tcPr>
     </w:tblStylePr>
+  </w:style>
+  <w:style w:type="character" w:styleId="Hipervnculo">
+    <w:name w:val="Hyperlink"/>
+    <w:basedOn w:val="Fuentedeprrafopredeter"/>
+    <w:uiPriority w:val="99"/>
+    <w:unhideWhenUsed/>
+    <w:rsid w:val="008A5993"/>
+    <w:rPr>
+      <w:color w:val="0000FF" w:themeColor="hyperlink"/>
+      <w:u w:val="single"/>
+    </w:rPr>
+  </w:style>
+  <w:style w:type="character" w:styleId="Mencinsinresolver">
+    <w:name w:val="Unresolved Mention"/>
+    <w:basedOn w:val="Fuentedeprrafopredeter"/>
+    <w:uiPriority w:val="99"/>
+    <w:semiHidden/>
+    <w:unhideWhenUsed/>
+    <w:rsid w:val="008A5993"/>
+    <w:rPr>
+      <w:color w:val="605E5C"/>
+      <w:shd w:val="clear" w:color="auto" w:fill="E1DFDD"/>
+    </w:rPr>
   </w:style>
 </w:styles>
 </file>

</xml_diff>